<commit_message>
frontend inital work commplete
</commit_message>
<xml_diff>
--- a/Phase 1.docx
+++ b/Phase 1.docx
@@ -4342,6 +4342,14 @@
     </w:p>
     <w:p>
       <w:r>
+        <w:rPr>
+          <w:noProof/>
+        </w:rPr>
+        <w:pict>
+          <v:shape id="_x0000_s1030" type="#_x0000_t32" style="position:absolute;margin-left:-66.6pt;margin-top:14.4pt;width:591.85pt;height:5.85pt;flip:y;z-index:251662336" o:connectortype="straight"/>
+        </w:pict>
+      </w:r>
+      <w:r>
         <w:t xml:space="preserve">└── </w:t>
       </w:r>
       <w:proofErr w:type="spellStart"/>
@@ -4352,10 +4360,1371 @@
     </w:p>
     <w:p/>
     <w:p>
+      <w:pPr>
+        <w:spacing w:before="100" w:beforeAutospacing="1" w:after="100" w:afterAutospacing="1" w:line="240" w:lineRule="auto"/>
+        <w:outlineLvl w:val="2"/>
+        <w:rPr>
+          <w:rFonts w:ascii="Times New Roman" w:eastAsia="Times New Roman" w:hAnsi="Times New Roman" w:cs="Times New Roman"/>
+          <w:b/>
+          <w:bCs/>
+          <w:sz w:val="27"/>
+          <w:szCs w:val="27"/>
+        </w:rPr>
+      </w:pPr>
+      <w:r>
+        <w:rPr>
+          <w:rFonts w:ascii="Times New Roman" w:eastAsia="Times New Roman" w:hAnsi="Times New Roman" w:cs="Times New Roman"/>
+          <w:b/>
+          <w:bCs/>
+          <w:sz w:val="27"/>
+          <w:szCs w:val="27"/>
+        </w:rPr>
+        <w:t>Phase 1: Foundation &amp; Authentication</w:t>
+      </w:r>
+    </w:p>
+    <w:p>
+      <w:pPr>
+        <w:spacing w:before="100" w:beforeAutospacing="1" w:after="100" w:afterAutospacing="1" w:line="240" w:lineRule="auto"/>
+        <w:rPr>
+          <w:rFonts w:ascii="Times New Roman" w:eastAsia="Times New Roman" w:hAnsi="Times New Roman" w:cs="Times New Roman"/>
+          <w:sz w:val="24"/>
+          <w:szCs w:val="24"/>
+        </w:rPr>
+      </w:pPr>
+      <w:r>
+        <w:rPr>
+          <w:rFonts w:ascii="Times New Roman" w:eastAsia="Times New Roman" w:hAnsi="Times New Roman" w:cs="Times New Roman"/>
+          <w:sz w:val="24"/>
+          <w:szCs w:val="24"/>
+        </w:rPr>
+        <w:t>Since we just ripped out Clerk, our first priority is to build the custom authentication flow and the main application shell.</w:t>
+      </w:r>
+    </w:p>
+    <w:p>
+      <w:pPr>
+        <w:numPr>
+          <w:ilvl w:val="0"/>
+          <w:numId w:val="17"/>
+        </w:numPr>
+        <w:spacing w:before="100" w:beforeAutospacing="1" w:after="100" w:afterAutospacing="1" w:line="240" w:lineRule="auto"/>
+        <w:rPr>
+          <w:rFonts w:ascii="Times New Roman" w:eastAsia="Times New Roman" w:hAnsi="Times New Roman" w:cs="Times New Roman"/>
+          <w:sz w:val="24"/>
+          <w:szCs w:val="24"/>
+        </w:rPr>
+      </w:pPr>
+      <w:r>
+        <w:rPr>
+          <w:rFonts w:ascii="Times New Roman" w:eastAsia="Times New Roman" w:hAnsi="Times New Roman" w:cs="Times New Roman"/>
+          <w:b/>
+          <w:bCs/>
+          <w:sz w:val="24"/>
+          <w:szCs w:val="24"/>
+        </w:rPr>
+        <w:t>Step 1: Auth Pages.</w:t>
+      </w:r>
+      <w:r>
+        <w:rPr>
+          <w:rFonts w:ascii="Times New Roman" w:eastAsia="Times New Roman" w:hAnsi="Times New Roman" w:cs="Times New Roman"/>
+          <w:sz w:val="24"/>
+          <w:szCs w:val="24"/>
+        </w:rPr>
+        <w:t xml:space="preserve"> You will provide any existing login/register designs you have, or I will generate standard </w:t>
+      </w:r>
+      <w:r>
+        <w:rPr>
+          <w:rFonts w:ascii="Courier New" w:eastAsia="Times New Roman" w:hAnsi="Courier New" w:cs="Courier New"/>
+          <w:sz w:val="20"/>
+        </w:rPr>
+        <w:t>Login.jsx</w:t>
+      </w:r>
+      <w:r>
+        <w:rPr>
+          <w:rFonts w:ascii="Times New Roman" w:eastAsia="Times New Roman" w:hAnsi="Times New Roman" w:cs="Times New Roman"/>
+          <w:sz w:val="24"/>
+          <w:szCs w:val="24"/>
+        </w:rPr>
+        <w:t xml:space="preserve"> and </w:t>
+      </w:r>
+      <w:r>
+        <w:rPr>
+          <w:rFonts w:ascii="Courier New" w:eastAsia="Times New Roman" w:hAnsi="Courier New" w:cs="Courier New"/>
+          <w:sz w:val="20"/>
+        </w:rPr>
+        <w:t>Register.jsx</w:t>
+      </w:r>
+      <w:r>
+        <w:rPr>
+          <w:rFonts w:ascii="Times New Roman" w:eastAsia="Times New Roman" w:hAnsi="Times New Roman" w:cs="Times New Roman"/>
+          <w:sz w:val="24"/>
+          <w:szCs w:val="24"/>
+        </w:rPr>
+        <w:t xml:space="preserve"> pages using your Tailwind design language to connect to our </w:t>
+      </w:r>
+      <w:r>
+        <w:rPr>
+          <w:rFonts w:ascii="Courier New" w:eastAsia="Times New Roman" w:hAnsi="Courier New" w:cs="Courier New"/>
+          <w:sz w:val="20"/>
+        </w:rPr>
+        <w:t>/</w:t>
+      </w:r>
+      <w:proofErr w:type="spellStart"/>
+      <w:r>
+        <w:rPr>
+          <w:rFonts w:ascii="Courier New" w:eastAsia="Times New Roman" w:hAnsi="Courier New" w:cs="Courier New"/>
+          <w:sz w:val="20"/>
+        </w:rPr>
+        <w:t>api</w:t>
+      </w:r>
+      <w:proofErr w:type="spellEnd"/>
+      <w:r>
+        <w:rPr>
+          <w:rFonts w:ascii="Courier New" w:eastAsia="Times New Roman" w:hAnsi="Courier New" w:cs="Courier New"/>
+          <w:sz w:val="20"/>
+        </w:rPr>
+        <w:t>/auth</w:t>
+      </w:r>
+      <w:r>
+        <w:rPr>
+          <w:rFonts w:ascii="Times New Roman" w:eastAsia="Times New Roman" w:hAnsi="Times New Roman" w:cs="Times New Roman"/>
+          <w:sz w:val="24"/>
+          <w:szCs w:val="24"/>
+        </w:rPr>
+        <w:t xml:space="preserve"> endpoints.</w:t>
+      </w:r>
+    </w:p>
+    <w:p>
+      <w:pPr>
+        <w:numPr>
+          <w:ilvl w:val="0"/>
+          <w:numId w:val="17"/>
+        </w:numPr>
+        <w:spacing w:before="100" w:beforeAutospacing="1" w:after="100" w:afterAutospacing="1" w:line="240" w:lineRule="auto"/>
+        <w:rPr>
+          <w:rFonts w:ascii="Times New Roman" w:eastAsia="Times New Roman" w:hAnsi="Times New Roman" w:cs="Times New Roman"/>
+          <w:sz w:val="24"/>
+          <w:szCs w:val="24"/>
+        </w:rPr>
+      </w:pPr>
+      <w:r>
+        <w:rPr>
+          <w:rFonts w:ascii="Times New Roman" w:eastAsia="Times New Roman" w:hAnsi="Times New Roman" w:cs="Times New Roman"/>
+          <w:b/>
+          <w:bCs/>
+          <w:sz w:val="24"/>
+          <w:szCs w:val="24"/>
+        </w:rPr>
+        <w:lastRenderedPageBreak/>
+        <w:t>Step 2: Core Layout Components.</w:t>
+      </w:r>
+      <w:r>
+        <w:rPr>
+          <w:rFonts w:ascii="Times New Roman" w:eastAsia="Times New Roman" w:hAnsi="Times New Roman" w:cs="Times New Roman"/>
+          <w:sz w:val="24"/>
+          <w:szCs w:val="24"/>
+        </w:rPr>
+        <w:t xml:space="preserve"> You will provide </w:t>
+      </w:r>
+      <w:r>
+        <w:rPr>
+          <w:rFonts w:ascii="Courier New" w:eastAsia="Times New Roman" w:hAnsi="Courier New" w:cs="Courier New"/>
+          <w:sz w:val="20"/>
+        </w:rPr>
+        <w:t>Layout.jsx</w:t>
+      </w:r>
+      <w:r>
+        <w:rPr>
+          <w:rFonts w:ascii="Times New Roman" w:eastAsia="Times New Roman" w:hAnsi="Times New Roman" w:cs="Times New Roman"/>
+          <w:sz w:val="24"/>
+          <w:szCs w:val="24"/>
+        </w:rPr>
+        <w:t xml:space="preserve">, </w:t>
+      </w:r>
+      <w:r>
+        <w:rPr>
+          <w:rFonts w:ascii="Courier New" w:eastAsia="Times New Roman" w:hAnsi="Courier New" w:cs="Courier New"/>
+          <w:sz w:val="20"/>
+        </w:rPr>
+        <w:t>Sidebar.jsx</w:t>
+      </w:r>
+      <w:r>
+        <w:rPr>
+          <w:rFonts w:ascii="Times New Roman" w:eastAsia="Times New Roman" w:hAnsi="Times New Roman" w:cs="Times New Roman"/>
+          <w:sz w:val="24"/>
+          <w:szCs w:val="24"/>
+        </w:rPr>
+        <w:t xml:space="preserve">, and </w:t>
+      </w:r>
+      <w:r>
+        <w:rPr>
+          <w:rFonts w:ascii="Courier New" w:eastAsia="Times New Roman" w:hAnsi="Courier New" w:cs="Courier New"/>
+          <w:sz w:val="20"/>
+        </w:rPr>
+        <w:t>NavBar.jsx</w:t>
+      </w:r>
+      <w:r>
+        <w:rPr>
+          <w:rFonts w:ascii="Times New Roman" w:eastAsia="Times New Roman" w:hAnsi="Times New Roman" w:cs="Times New Roman"/>
+          <w:sz w:val="24"/>
+          <w:szCs w:val="24"/>
+        </w:rPr>
+        <w:t xml:space="preserve"> (or </w:t>
+      </w:r>
+      <w:r>
+        <w:rPr>
+          <w:rFonts w:ascii="Courier New" w:eastAsia="Times New Roman" w:hAnsi="Courier New" w:cs="Courier New"/>
+          <w:sz w:val="20"/>
+        </w:rPr>
+        <w:t>Header.jsx</w:t>
+      </w:r>
+      <w:r>
+        <w:rPr>
+          <w:rFonts w:ascii="Times New Roman" w:eastAsia="Times New Roman" w:hAnsi="Times New Roman" w:cs="Times New Roman"/>
+          <w:sz w:val="24"/>
+          <w:szCs w:val="24"/>
+        </w:rPr>
+        <w:t xml:space="preserve">). We will rewire these to read user data (name, email, </w:t>
+      </w:r>
+      <w:proofErr w:type="gramStart"/>
+      <w:r>
+        <w:rPr>
+          <w:rFonts w:ascii="Times New Roman" w:eastAsia="Times New Roman" w:hAnsi="Times New Roman" w:cs="Times New Roman"/>
+          <w:sz w:val="24"/>
+          <w:szCs w:val="24"/>
+        </w:rPr>
+        <w:t>plan</w:t>
+      </w:r>
+      <w:proofErr w:type="gramEnd"/>
+      <w:r>
+        <w:rPr>
+          <w:rFonts w:ascii="Times New Roman" w:eastAsia="Times New Roman" w:hAnsi="Times New Roman" w:cs="Times New Roman"/>
+          <w:sz w:val="24"/>
+          <w:szCs w:val="24"/>
+        </w:rPr>
+        <w:t xml:space="preserve">) from the new </w:t>
+      </w:r>
+      <w:proofErr w:type="spellStart"/>
+      <w:r>
+        <w:rPr>
+          <w:rFonts w:ascii="Courier New" w:eastAsia="Times New Roman" w:hAnsi="Courier New" w:cs="Courier New"/>
+          <w:sz w:val="20"/>
+        </w:rPr>
+        <w:t>AuthContext</w:t>
+      </w:r>
+      <w:proofErr w:type="spellEnd"/>
+      <w:r>
+        <w:rPr>
+          <w:rFonts w:ascii="Times New Roman" w:eastAsia="Times New Roman" w:hAnsi="Times New Roman" w:cs="Times New Roman"/>
+          <w:sz w:val="24"/>
+          <w:szCs w:val="24"/>
+        </w:rPr>
+        <w:t xml:space="preserve"> and implement the custom logout logic.</w:t>
+      </w:r>
+    </w:p>
+    <w:p>
+      <w:pPr>
+        <w:spacing w:before="100" w:beforeAutospacing="1" w:after="100" w:afterAutospacing="1" w:line="240" w:lineRule="auto"/>
+        <w:outlineLvl w:val="2"/>
+        <w:rPr>
+          <w:rFonts w:ascii="Times New Roman" w:eastAsia="Times New Roman" w:hAnsi="Times New Roman" w:cs="Times New Roman"/>
+          <w:b/>
+          <w:bCs/>
+          <w:sz w:val="27"/>
+          <w:szCs w:val="27"/>
+        </w:rPr>
+      </w:pPr>
+      <w:r>
+        <w:rPr>
+          <w:rFonts w:ascii="Times New Roman" w:eastAsia="Times New Roman" w:hAnsi="Times New Roman" w:cs="Times New Roman"/>
+          <w:b/>
+          <w:bCs/>
+          <w:sz w:val="27"/>
+          <w:szCs w:val="27"/>
+        </w:rPr>
+        <w:t>Phase 2: Standard AI Tools &amp; Dashboard</w:t>
+      </w:r>
+    </w:p>
+    <w:p>
+      <w:pPr>
+        <w:spacing w:before="100" w:beforeAutospacing="1" w:after="100" w:afterAutospacing="1" w:line="240" w:lineRule="auto"/>
+        <w:rPr>
+          <w:rFonts w:ascii="Times New Roman" w:eastAsia="Times New Roman" w:hAnsi="Times New Roman" w:cs="Times New Roman"/>
+          <w:sz w:val="24"/>
+          <w:szCs w:val="24"/>
+        </w:rPr>
+      </w:pPr>
+      <w:r>
+        <w:rPr>
+          <w:rFonts w:ascii="Times New Roman" w:eastAsia="Times New Roman" w:hAnsi="Times New Roman" w:cs="Times New Roman"/>
+          <w:sz w:val="24"/>
+          <w:szCs w:val="24"/>
+        </w:rPr>
+        <w:t>Once the user can log in and navigate the shell, we will connect the standard, single-shot AI tools.</w:t>
+      </w:r>
+    </w:p>
+    <w:p>
+      <w:pPr>
+        <w:numPr>
+          <w:ilvl w:val="0"/>
+          <w:numId w:val="18"/>
+        </w:numPr>
+        <w:spacing w:before="100" w:beforeAutospacing="1" w:after="100" w:afterAutospacing="1" w:line="240" w:lineRule="auto"/>
+        <w:rPr>
+          <w:rFonts w:ascii="Times New Roman" w:eastAsia="Times New Roman" w:hAnsi="Times New Roman" w:cs="Times New Roman"/>
+          <w:sz w:val="24"/>
+          <w:szCs w:val="24"/>
+        </w:rPr>
+      </w:pPr>
+      <w:r>
+        <w:rPr>
+          <w:rFonts w:ascii="Times New Roman" w:eastAsia="Times New Roman" w:hAnsi="Times New Roman" w:cs="Times New Roman"/>
+          <w:b/>
+          <w:bCs/>
+          <w:sz w:val="24"/>
+          <w:szCs w:val="24"/>
+        </w:rPr>
+        <w:t>Step 1: Text Tools.</w:t>
+      </w:r>
+      <w:r>
+        <w:rPr>
+          <w:rFonts w:ascii="Times New Roman" w:eastAsia="Times New Roman" w:hAnsi="Times New Roman" w:cs="Times New Roman"/>
+          <w:sz w:val="24"/>
+          <w:szCs w:val="24"/>
+        </w:rPr>
+        <w:t xml:space="preserve"> </w:t>
+      </w:r>
+      <w:proofErr w:type="gramStart"/>
+      <w:r>
+        <w:rPr>
+          <w:rFonts w:ascii="Times New Roman" w:eastAsia="Times New Roman" w:hAnsi="Times New Roman" w:cs="Times New Roman"/>
+          <w:sz w:val="24"/>
+          <w:szCs w:val="24"/>
+        </w:rPr>
+        <w:t>Migrate</w:t>
+      </w:r>
+      <w:proofErr w:type="gramEnd"/>
+      <w:r>
+        <w:rPr>
+          <w:rFonts w:ascii="Times New Roman" w:eastAsia="Times New Roman" w:hAnsi="Times New Roman" w:cs="Times New Roman"/>
+          <w:sz w:val="24"/>
+          <w:szCs w:val="24"/>
+        </w:rPr>
+        <w:t xml:space="preserve"> </w:t>
+      </w:r>
+      <w:r>
+        <w:rPr>
+          <w:rFonts w:ascii="Courier New" w:eastAsia="Times New Roman" w:hAnsi="Courier New" w:cs="Courier New"/>
+          <w:sz w:val="20"/>
+        </w:rPr>
+        <w:t>WriteArticle.jsx</w:t>
+      </w:r>
+      <w:r>
+        <w:rPr>
+          <w:rFonts w:ascii="Times New Roman" w:eastAsia="Times New Roman" w:hAnsi="Times New Roman" w:cs="Times New Roman"/>
+          <w:sz w:val="24"/>
+          <w:szCs w:val="24"/>
+        </w:rPr>
+        <w:t xml:space="preserve"> and </w:t>
+      </w:r>
+      <w:r>
+        <w:rPr>
+          <w:rFonts w:ascii="Courier New" w:eastAsia="Times New Roman" w:hAnsi="Courier New" w:cs="Courier New"/>
+          <w:sz w:val="20"/>
+        </w:rPr>
+        <w:t>BlogTitles.jsx</w:t>
+      </w:r>
+      <w:r>
+        <w:rPr>
+          <w:rFonts w:ascii="Times New Roman" w:eastAsia="Times New Roman" w:hAnsi="Times New Roman" w:cs="Times New Roman"/>
+          <w:sz w:val="24"/>
+          <w:szCs w:val="24"/>
+        </w:rPr>
+        <w:t xml:space="preserve"> to hit the </w:t>
+      </w:r>
+      <w:r>
+        <w:rPr>
+          <w:rFonts w:ascii="Courier New" w:eastAsia="Times New Roman" w:hAnsi="Courier New" w:cs="Courier New"/>
+          <w:sz w:val="20"/>
+        </w:rPr>
+        <w:t>/</w:t>
+      </w:r>
+      <w:proofErr w:type="spellStart"/>
+      <w:r>
+        <w:rPr>
+          <w:rFonts w:ascii="Courier New" w:eastAsia="Times New Roman" w:hAnsi="Courier New" w:cs="Courier New"/>
+          <w:sz w:val="20"/>
+        </w:rPr>
+        <w:t>api</w:t>
+      </w:r>
+      <w:proofErr w:type="spellEnd"/>
+      <w:r>
+        <w:rPr>
+          <w:rFonts w:ascii="Courier New" w:eastAsia="Times New Roman" w:hAnsi="Courier New" w:cs="Courier New"/>
+          <w:sz w:val="20"/>
+        </w:rPr>
+        <w:t>/content</w:t>
+      </w:r>
+      <w:r>
+        <w:rPr>
+          <w:rFonts w:ascii="Times New Roman" w:eastAsia="Times New Roman" w:hAnsi="Times New Roman" w:cs="Times New Roman"/>
+          <w:sz w:val="24"/>
+          <w:szCs w:val="24"/>
+        </w:rPr>
+        <w:t xml:space="preserve"> routes.</w:t>
+      </w:r>
+    </w:p>
+    <w:p>
+      <w:pPr>
+        <w:numPr>
+          <w:ilvl w:val="0"/>
+          <w:numId w:val="18"/>
+        </w:numPr>
+        <w:spacing w:before="100" w:beforeAutospacing="1" w:after="100" w:afterAutospacing="1" w:line="240" w:lineRule="auto"/>
+        <w:rPr>
+          <w:rFonts w:ascii="Times New Roman" w:eastAsia="Times New Roman" w:hAnsi="Times New Roman" w:cs="Times New Roman"/>
+          <w:sz w:val="24"/>
+          <w:szCs w:val="24"/>
+        </w:rPr>
+      </w:pPr>
+      <w:r>
+        <w:rPr>
+          <w:rFonts w:ascii="Times New Roman" w:eastAsia="Times New Roman" w:hAnsi="Times New Roman" w:cs="Times New Roman"/>
+          <w:b/>
+          <w:bCs/>
+          <w:sz w:val="24"/>
+          <w:szCs w:val="24"/>
+        </w:rPr>
+        <w:t>Step 2: Image &amp; Document Tools.</w:t>
+      </w:r>
+      <w:r>
+        <w:rPr>
+          <w:rFonts w:ascii="Times New Roman" w:eastAsia="Times New Roman" w:hAnsi="Times New Roman" w:cs="Times New Roman"/>
+          <w:sz w:val="24"/>
+          <w:szCs w:val="24"/>
+        </w:rPr>
+        <w:t xml:space="preserve"> Migrate </w:t>
+      </w:r>
+      <w:r>
+        <w:rPr>
+          <w:rFonts w:ascii="Courier New" w:eastAsia="Times New Roman" w:hAnsi="Courier New" w:cs="Courier New"/>
+          <w:sz w:val="20"/>
+        </w:rPr>
+        <w:t>Generateimages.jsx</w:t>
+      </w:r>
+      <w:r>
+        <w:rPr>
+          <w:rFonts w:ascii="Times New Roman" w:eastAsia="Times New Roman" w:hAnsi="Times New Roman" w:cs="Times New Roman"/>
+          <w:sz w:val="24"/>
+          <w:szCs w:val="24"/>
+        </w:rPr>
+        <w:t xml:space="preserve">, </w:t>
+      </w:r>
+      <w:r>
+        <w:rPr>
+          <w:rFonts w:ascii="Courier New" w:eastAsia="Times New Roman" w:hAnsi="Courier New" w:cs="Courier New"/>
+          <w:sz w:val="20"/>
+        </w:rPr>
+        <w:t>RemoveBackground.jsx</w:t>
+      </w:r>
+      <w:r>
+        <w:rPr>
+          <w:rFonts w:ascii="Times New Roman" w:eastAsia="Times New Roman" w:hAnsi="Times New Roman" w:cs="Times New Roman"/>
+          <w:sz w:val="24"/>
+          <w:szCs w:val="24"/>
+        </w:rPr>
+        <w:t xml:space="preserve">, </w:t>
+      </w:r>
+      <w:r>
+        <w:rPr>
+          <w:rFonts w:ascii="Courier New" w:eastAsia="Times New Roman" w:hAnsi="Courier New" w:cs="Courier New"/>
+          <w:sz w:val="20"/>
+        </w:rPr>
+        <w:t>RemoveObject.jsx</w:t>
+      </w:r>
+      <w:r>
+        <w:rPr>
+          <w:rFonts w:ascii="Times New Roman" w:eastAsia="Times New Roman" w:hAnsi="Times New Roman" w:cs="Times New Roman"/>
+          <w:sz w:val="24"/>
+          <w:szCs w:val="24"/>
+        </w:rPr>
+        <w:t xml:space="preserve">, and </w:t>
+      </w:r>
+      <w:r>
+        <w:rPr>
+          <w:rFonts w:ascii="Courier New" w:eastAsia="Times New Roman" w:hAnsi="Courier New" w:cs="Courier New"/>
+          <w:sz w:val="20"/>
+        </w:rPr>
+        <w:t>ReviewResume.jsx</w:t>
+      </w:r>
+      <w:r>
+        <w:rPr>
+          <w:rFonts w:ascii="Times New Roman" w:eastAsia="Times New Roman" w:hAnsi="Times New Roman" w:cs="Times New Roman"/>
+          <w:sz w:val="24"/>
+          <w:szCs w:val="24"/>
+        </w:rPr>
+        <w:t xml:space="preserve"> to securely handle file uploads (</w:t>
+      </w:r>
+      <w:proofErr w:type="spellStart"/>
+      <w:r>
+        <w:rPr>
+          <w:rFonts w:ascii="Times New Roman" w:eastAsia="Times New Roman" w:hAnsi="Times New Roman" w:cs="Times New Roman"/>
+          <w:sz w:val="24"/>
+          <w:szCs w:val="24"/>
+        </w:rPr>
+        <w:t>Multer</w:t>
+      </w:r>
+      <w:proofErr w:type="spellEnd"/>
+      <w:r>
+        <w:rPr>
+          <w:rFonts w:ascii="Times New Roman" w:eastAsia="Times New Roman" w:hAnsi="Times New Roman" w:cs="Times New Roman"/>
+          <w:sz w:val="24"/>
+          <w:szCs w:val="24"/>
+        </w:rPr>
+        <w:t>/</w:t>
+      </w:r>
+      <w:proofErr w:type="spellStart"/>
+      <w:r>
+        <w:rPr>
+          <w:rFonts w:ascii="Times New Roman" w:eastAsia="Times New Roman" w:hAnsi="Times New Roman" w:cs="Times New Roman"/>
+          <w:sz w:val="24"/>
+          <w:szCs w:val="24"/>
+        </w:rPr>
+        <w:t>FormData</w:t>
+      </w:r>
+      <w:proofErr w:type="spellEnd"/>
+      <w:r>
+        <w:rPr>
+          <w:rFonts w:ascii="Times New Roman" w:eastAsia="Times New Roman" w:hAnsi="Times New Roman" w:cs="Times New Roman"/>
+          <w:sz w:val="24"/>
+          <w:szCs w:val="24"/>
+        </w:rPr>
+        <w:t xml:space="preserve">) and hit the </w:t>
+      </w:r>
+      <w:r>
+        <w:rPr>
+          <w:rFonts w:ascii="Courier New" w:eastAsia="Times New Roman" w:hAnsi="Courier New" w:cs="Courier New"/>
+          <w:sz w:val="20"/>
+        </w:rPr>
+        <w:t>/</w:t>
+      </w:r>
+      <w:proofErr w:type="spellStart"/>
+      <w:r>
+        <w:rPr>
+          <w:rFonts w:ascii="Courier New" w:eastAsia="Times New Roman" w:hAnsi="Courier New" w:cs="Courier New"/>
+          <w:sz w:val="20"/>
+        </w:rPr>
+        <w:t>api</w:t>
+      </w:r>
+      <w:proofErr w:type="spellEnd"/>
+      <w:r>
+        <w:rPr>
+          <w:rFonts w:ascii="Courier New" w:eastAsia="Times New Roman" w:hAnsi="Courier New" w:cs="Courier New"/>
+          <w:sz w:val="20"/>
+        </w:rPr>
+        <w:t>/image</w:t>
+      </w:r>
+      <w:r>
+        <w:rPr>
+          <w:rFonts w:ascii="Times New Roman" w:eastAsia="Times New Roman" w:hAnsi="Times New Roman" w:cs="Times New Roman"/>
+          <w:sz w:val="24"/>
+          <w:szCs w:val="24"/>
+        </w:rPr>
+        <w:t xml:space="preserve"> and </w:t>
+      </w:r>
+      <w:r>
+        <w:rPr>
+          <w:rFonts w:ascii="Courier New" w:eastAsia="Times New Roman" w:hAnsi="Courier New" w:cs="Courier New"/>
+          <w:sz w:val="20"/>
+        </w:rPr>
+        <w:t>/</w:t>
+      </w:r>
+      <w:proofErr w:type="spellStart"/>
+      <w:r>
+        <w:rPr>
+          <w:rFonts w:ascii="Courier New" w:eastAsia="Times New Roman" w:hAnsi="Courier New" w:cs="Courier New"/>
+          <w:sz w:val="20"/>
+        </w:rPr>
+        <w:t>api</w:t>
+      </w:r>
+      <w:proofErr w:type="spellEnd"/>
+      <w:r>
+        <w:rPr>
+          <w:rFonts w:ascii="Courier New" w:eastAsia="Times New Roman" w:hAnsi="Courier New" w:cs="Courier New"/>
+          <w:sz w:val="20"/>
+        </w:rPr>
+        <w:t>/document</w:t>
+      </w:r>
+      <w:r>
+        <w:rPr>
+          <w:rFonts w:ascii="Times New Roman" w:eastAsia="Times New Roman" w:hAnsi="Times New Roman" w:cs="Times New Roman"/>
+          <w:sz w:val="24"/>
+          <w:szCs w:val="24"/>
+        </w:rPr>
+        <w:t xml:space="preserve"> routes.</w:t>
+      </w:r>
+    </w:p>
+    <w:p>
+      <w:pPr>
+        <w:numPr>
+          <w:ilvl w:val="0"/>
+          <w:numId w:val="18"/>
+        </w:numPr>
+        <w:spacing w:before="100" w:beforeAutospacing="1" w:after="100" w:afterAutospacing="1" w:line="240" w:lineRule="auto"/>
+        <w:rPr>
+          <w:rFonts w:ascii="Times New Roman" w:eastAsia="Times New Roman" w:hAnsi="Times New Roman" w:cs="Times New Roman"/>
+          <w:sz w:val="24"/>
+          <w:szCs w:val="24"/>
+        </w:rPr>
+      </w:pPr>
+      <w:r>
+        <w:rPr>
+          <w:rFonts w:ascii="Times New Roman" w:eastAsia="Times New Roman" w:hAnsi="Times New Roman" w:cs="Times New Roman"/>
+          <w:b/>
+          <w:bCs/>
+          <w:sz w:val="24"/>
+          <w:szCs w:val="24"/>
+        </w:rPr>
+        <w:t>Step 3: The Dashboard.</w:t>
+      </w:r>
+      <w:r>
+        <w:rPr>
+          <w:rFonts w:ascii="Times New Roman" w:eastAsia="Times New Roman" w:hAnsi="Times New Roman" w:cs="Times New Roman"/>
+          <w:sz w:val="24"/>
+          <w:szCs w:val="24"/>
+        </w:rPr>
+        <w:t xml:space="preserve"> </w:t>
+      </w:r>
+      <w:proofErr w:type="gramStart"/>
+      <w:r>
+        <w:rPr>
+          <w:rFonts w:ascii="Times New Roman" w:eastAsia="Times New Roman" w:hAnsi="Times New Roman" w:cs="Times New Roman"/>
+          <w:sz w:val="24"/>
+          <w:szCs w:val="24"/>
+        </w:rPr>
+        <w:t>Migrate</w:t>
+      </w:r>
+      <w:proofErr w:type="gramEnd"/>
+      <w:r>
+        <w:rPr>
+          <w:rFonts w:ascii="Times New Roman" w:eastAsia="Times New Roman" w:hAnsi="Times New Roman" w:cs="Times New Roman"/>
+          <w:sz w:val="24"/>
+          <w:szCs w:val="24"/>
+        </w:rPr>
+        <w:t xml:space="preserve"> </w:t>
+      </w:r>
+      <w:r>
+        <w:rPr>
+          <w:rFonts w:ascii="Courier New" w:eastAsia="Times New Roman" w:hAnsi="Courier New" w:cs="Courier New"/>
+          <w:sz w:val="20"/>
+        </w:rPr>
+        <w:t>Dashboard.jsx</w:t>
+      </w:r>
+      <w:r>
+        <w:rPr>
+          <w:rFonts w:ascii="Times New Roman" w:eastAsia="Times New Roman" w:hAnsi="Times New Roman" w:cs="Times New Roman"/>
+          <w:sz w:val="24"/>
+          <w:szCs w:val="24"/>
+        </w:rPr>
+        <w:t xml:space="preserve"> to fetch the unified data packet from your </w:t>
+      </w:r>
+      <w:r>
+        <w:rPr>
+          <w:rFonts w:ascii="Courier New" w:eastAsia="Times New Roman" w:hAnsi="Courier New" w:cs="Courier New"/>
+          <w:sz w:val="20"/>
+        </w:rPr>
+        <w:t>/</w:t>
+      </w:r>
+      <w:proofErr w:type="spellStart"/>
+      <w:r>
+        <w:rPr>
+          <w:rFonts w:ascii="Courier New" w:eastAsia="Times New Roman" w:hAnsi="Courier New" w:cs="Courier New"/>
+          <w:sz w:val="20"/>
+        </w:rPr>
+        <w:t>api</w:t>
+      </w:r>
+      <w:proofErr w:type="spellEnd"/>
+      <w:r>
+        <w:rPr>
+          <w:rFonts w:ascii="Courier New" w:eastAsia="Times New Roman" w:hAnsi="Courier New" w:cs="Courier New"/>
+          <w:sz w:val="20"/>
+        </w:rPr>
+        <w:t>/history</w:t>
+      </w:r>
+      <w:r>
+        <w:rPr>
+          <w:rFonts w:ascii="Times New Roman" w:eastAsia="Times New Roman" w:hAnsi="Times New Roman" w:cs="Times New Roman"/>
+          <w:sz w:val="24"/>
+          <w:szCs w:val="24"/>
+        </w:rPr>
+        <w:t xml:space="preserve"> endpoint, populating the UI with the user's past generations.</w:t>
+      </w:r>
+    </w:p>
+    <w:p>
+      <w:pPr>
+        <w:spacing w:before="100" w:beforeAutospacing="1" w:after="100" w:afterAutospacing="1" w:line="240" w:lineRule="auto"/>
+        <w:outlineLvl w:val="2"/>
+        <w:rPr>
+          <w:rFonts w:ascii="Times New Roman" w:eastAsia="Times New Roman" w:hAnsi="Times New Roman" w:cs="Times New Roman"/>
+          <w:b/>
+          <w:bCs/>
+          <w:sz w:val="27"/>
+          <w:szCs w:val="27"/>
+        </w:rPr>
+      </w:pPr>
+      <w:r>
+        <w:rPr>
+          <w:rFonts w:ascii="Times New Roman" w:eastAsia="Times New Roman" w:hAnsi="Times New Roman" w:cs="Times New Roman"/>
+          <w:b/>
+          <w:bCs/>
+          <w:sz w:val="27"/>
+          <w:szCs w:val="27"/>
+        </w:rPr>
+        <w:t>Phase 3: The YouTube AI Engine (The Crown Jewel)</w:t>
+      </w:r>
+    </w:p>
+    <w:p>
+      <w:pPr>
+        <w:spacing w:before="100" w:beforeAutospacing="1" w:after="100" w:afterAutospacing="1" w:line="240" w:lineRule="auto"/>
+        <w:rPr>
+          <w:rFonts w:ascii="Times New Roman" w:eastAsia="Times New Roman" w:hAnsi="Times New Roman" w:cs="Times New Roman"/>
+          <w:sz w:val="24"/>
+          <w:szCs w:val="24"/>
+        </w:rPr>
+      </w:pPr>
+      <w:r>
+        <w:rPr>
+          <w:rFonts w:ascii="Times New Roman" w:eastAsia="Times New Roman" w:hAnsi="Times New Roman" w:cs="Times New Roman"/>
+          <w:sz w:val="24"/>
+          <w:szCs w:val="24"/>
+        </w:rPr>
+        <w:t xml:space="preserve">This is where we implement the most complex features of your architecture (Chunking, </w:t>
+      </w:r>
+      <w:proofErr w:type="spellStart"/>
+      <w:r>
+        <w:rPr>
+          <w:rFonts w:ascii="Times New Roman" w:eastAsia="Times New Roman" w:hAnsi="Times New Roman" w:cs="Times New Roman"/>
+          <w:sz w:val="24"/>
+          <w:szCs w:val="24"/>
+        </w:rPr>
+        <w:t>Stateful</w:t>
+      </w:r>
+      <w:proofErr w:type="spellEnd"/>
+      <w:r>
+        <w:rPr>
+          <w:rFonts w:ascii="Times New Roman" w:eastAsia="Times New Roman" w:hAnsi="Times New Roman" w:cs="Times New Roman"/>
+          <w:sz w:val="24"/>
+          <w:szCs w:val="24"/>
+        </w:rPr>
+        <w:t xml:space="preserve"> Chat, </w:t>
+      </w:r>
+      <w:proofErr w:type="gramStart"/>
+      <w:r>
+        <w:rPr>
+          <w:rFonts w:ascii="Times New Roman" w:eastAsia="Times New Roman" w:hAnsi="Times New Roman" w:cs="Times New Roman"/>
+          <w:sz w:val="24"/>
+          <w:szCs w:val="24"/>
+        </w:rPr>
+        <w:t>Markdown</w:t>
+      </w:r>
+      <w:proofErr w:type="gramEnd"/>
+      <w:r>
+        <w:rPr>
+          <w:rFonts w:ascii="Times New Roman" w:eastAsia="Times New Roman" w:hAnsi="Times New Roman" w:cs="Times New Roman"/>
+          <w:sz w:val="24"/>
+          <w:szCs w:val="24"/>
+        </w:rPr>
+        <w:t>/Mermaid).</w:t>
+      </w:r>
+    </w:p>
+    <w:p>
+      <w:pPr>
+        <w:numPr>
+          <w:ilvl w:val="0"/>
+          <w:numId w:val="19"/>
+        </w:numPr>
+        <w:spacing w:before="100" w:beforeAutospacing="1" w:after="100" w:afterAutospacing="1" w:line="240" w:lineRule="auto"/>
+        <w:rPr>
+          <w:rFonts w:ascii="Times New Roman" w:eastAsia="Times New Roman" w:hAnsi="Times New Roman" w:cs="Times New Roman"/>
+          <w:sz w:val="24"/>
+          <w:szCs w:val="24"/>
+        </w:rPr>
+      </w:pPr>
+      <w:r>
+        <w:rPr>
+          <w:rFonts w:ascii="Times New Roman" w:eastAsia="Times New Roman" w:hAnsi="Times New Roman" w:cs="Times New Roman"/>
+          <w:b/>
+          <w:bCs/>
+          <w:sz w:val="24"/>
+          <w:szCs w:val="24"/>
+        </w:rPr>
+        <w:t>Step 1: YouTube Input &amp; Summarization.</w:t>
+      </w:r>
+      <w:r>
+        <w:rPr>
+          <w:rFonts w:ascii="Times New Roman" w:eastAsia="Times New Roman" w:hAnsi="Times New Roman" w:cs="Times New Roman"/>
+          <w:sz w:val="24"/>
+          <w:szCs w:val="24"/>
+        </w:rPr>
+        <w:t xml:space="preserve"> Build the UI to accept a YouTube URL and hit </w:t>
+      </w:r>
+      <w:r>
+        <w:rPr>
+          <w:rFonts w:ascii="Courier New" w:eastAsia="Times New Roman" w:hAnsi="Courier New" w:cs="Courier New"/>
+          <w:sz w:val="20"/>
+        </w:rPr>
+        <w:t>/</w:t>
+      </w:r>
+      <w:proofErr w:type="spellStart"/>
+      <w:r>
+        <w:rPr>
+          <w:rFonts w:ascii="Courier New" w:eastAsia="Times New Roman" w:hAnsi="Courier New" w:cs="Courier New"/>
+          <w:sz w:val="20"/>
+        </w:rPr>
+        <w:t>api</w:t>
+      </w:r>
+      <w:proofErr w:type="spellEnd"/>
+      <w:r>
+        <w:rPr>
+          <w:rFonts w:ascii="Courier New" w:eastAsia="Times New Roman" w:hAnsi="Courier New" w:cs="Courier New"/>
+          <w:sz w:val="20"/>
+        </w:rPr>
+        <w:t>/</w:t>
+      </w:r>
+      <w:proofErr w:type="spellStart"/>
+      <w:r>
+        <w:rPr>
+          <w:rFonts w:ascii="Courier New" w:eastAsia="Times New Roman" w:hAnsi="Courier New" w:cs="Courier New"/>
+          <w:sz w:val="20"/>
+        </w:rPr>
+        <w:t>youtube</w:t>
+      </w:r>
+      <w:proofErr w:type="spellEnd"/>
+      <w:r>
+        <w:rPr>
+          <w:rFonts w:ascii="Courier New" w:eastAsia="Times New Roman" w:hAnsi="Courier New" w:cs="Courier New"/>
+          <w:sz w:val="20"/>
+        </w:rPr>
+        <w:t>/summarize</w:t>
+      </w:r>
+      <w:r>
+        <w:rPr>
+          <w:rFonts w:ascii="Times New Roman" w:eastAsia="Times New Roman" w:hAnsi="Times New Roman" w:cs="Times New Roman"/>
+          <w:sz w:val="24"/>
+          <w:szCs w:val="24"/>
+        </w:rPr>
+        <w:t>.</w:t>
+      </w:r>
+    </w:p>
+    <w:p>
+      <w:pPr>
+        <w:numPr>
+          <w:ilvl w:val="0"/>
+          <w:numId w:val="19"/>
+        </w:numPr>
+        <w:spacing w:before="100" w:beforeAutospacing="1" w:after="100" w:afterAutospacing="1" w:line="240" w:lineRule="auto"/>
+        <w:rPr>
+          <w:rFonts w:ascii="Times New Roman" w:eastAsia="Times New Roman" w:hAnsi="Times New Roman" w:cs="Times New Roman"/>
+          <w:sz w:val="24"/>
+          <w:szCs w:val="24"/>
+        </w:rPr>
+      </w:pPr>
+      <w:r>
+        <w:rPr>
+          <w:rFonts w:ascii="Times New Roman" w:eastAsia="Times New Roman" w:hAnsi="Times New Roman" w:cs="Times New Roman"/>
+          <w:b/>
+          <w:bCs/>
+          <w:sz w:val="24"/>
+          <w:szCs w:val="24"/>
+        </w:rPr>
+        <w:t>Step 2: Renderers.</w:t>
+      </w:r>
+      <w:r>
+        <w:rPr>
+          <w:rFonts w:ascii="Times New Roman" w:eastAsia="Times New Roman" w:hAnsi="Times New Roman" w:cs="Times New Roman"/>
+          <w:sz w:val="24"/>
+          <w:szCs w:val="24"/>
+        </w:rPr>
+        <w:t xml:space="preserve"> Create the </w:t>
+      </w:r>
+      <w:r>
+        <w:rPr>
+          <w:rFonts w:ascii="Courier New" w:eastAsia="Times New Roman" w:hAnsi="Courier New" w:cs="Courier New"/>
+          <w:sz w:val="20"/>
+        </w:rPr>
+        <w:t>MarkdownViewer.jsx</w:t>
+      </w:r>
+      <w:r>
+        <w:rPr>
+          <w:rFonts w:ascii="Times New Roman" w:eastAsia="Times New Roman" w:hAnsi="Times New Roman" w:cs="Times New Roman"/>
+          <w:sz w:val="24"/>
+          <w:szCs w:val="24"/>
+        </w:rPr>
+        <w:t xml:space="preserve"> and </w:t>
+      </w:r>
+      <w:r>
+        <w:rPr>
+          <w:rFonts w:ascii="Courier New" w:eastAsia="Times New Roman" w:hAnsi="Courier New" w:cs="Courier New"/>
+          <w:sz w:val="20"/>
+        </w:rPr>
+        <w:t>MermaidDiagram.jsx</w:t>
+      </w:r>
+      <w:r>
+        <w:rPr>
+          <w:rFonts w:ascii="Times New Roman" w:eastAsia="Times New Roman" w:hAnsi="Times New Roman" w:cs="Times New Roman"/>
+          <w:sz w:val="24"/>
+          <w:szCs w:val="24"/>
+        </w:rPr>
+        <w:t xml:space="preserve"> components inside the </w:t>
+      </w:r>
+      <w:r>
+        <w:rPr>
+          <w:rFonts w:ascii="Courier New" w:eastAsia="Times New Roman" w:hAnsi="Courier New" w:cs="Courier New"/>
+          <w:sz w:val="20"/>
+        </w:rPr>
+        <w:t>components/renderers/</w:t>
+      </w:r>
+      <w:r>
+        <w:rPr>
+          <w:rFonts w:ascii="Times New Roman" w:eastAsia="Times New Roman" w:hAnsi="Times New Roman" w:cs="Times New Roman"/>
+          <w:sz w:val="24"/>
+          <w:szCs w:val="24"/>
+        </w:rPr>
+        <w:t xml:space="preserve"> folder to handle the massive text and diagram outputs safely.</w:t>
+      </w:r>
+    </w:p>
+    <w:p>
+      <w:pPr>
+        <w:numPr>
+          <w:ilvl w:val="0"/>
+          <w:numId w:val="19"/>
+        </w:numPr>
+        <w:spacing w:before="100" w:beforeAutospacing="1" w:after="100" w:afterAutospacing="1" w:line="240" w:lineRule="auto"/>
+        <w:rPr>
+          <w:rFonts w:ascii="Times New Roman" w:eastAsia="Times New Roman" w:hAnsi="Times New Roman" w:cs="Times New Roman"/>
+          <w:sz w:val="24"/>
+          <w:szCs w:val="24"/>
+        </w:rPr>
+      </w:pPr>
+      <w:r>
+        <w:rPr>
+          <w:rFonts w:ascii="Times New Roman" w:eastAsia="Times New Roman" w:hAnsi="Times New Roman" w:cs="Times New Roman"/>
+          <w:b/>
+          <w:bCs/>
+          <w:sz w:val="24"/>
+          <w:szCs w:val="24"/>
+        </w:rPr>
+        <w:t xml:space="preserve">Step 3: </w:t>
+      </w:r>
+      <w:proofErr w:type="spellStart"/>
+      <w:r>
+        <w:rPr>
+          <w:rFonts w:ascii="Times New Roman" w:eastAsia="Times New Roman" w:hAnsi="Times New Roman" w:cs="Times New Roman"/>
+          <w:b/>
+          <w:bCs/>
+          <w:sz w:val="24"/>
+          <w:szCs w:val="24"/>
+        </w:rPr>
+        <w:t>Stateful</w:t>
+      </w:r>
+      <w:proofErr w:type="spellEnd"/>
+      <w:r>
+        <w:rPr>
+          <w:rFonts w:ascii="Times New Roman" w:eastAsia="Times New Roman" w:hAnsi="Times New Roman" w:cs="Times New Roman"/>
+          <w:b/>
+          <w:bCs/>
+          <w:sz w:val="24"/>
+          <w:szCs w:val="24"/>
+        </w:rPr>
+        <w:t xml:space="preserve"> Chat Hook.</w:t>
+      </w:r>
+      <w:r>
+        <w:rPr>
+          <w:rFonts w:ascii="Times New Roman" w:eastAsia="Times New Roman" w:hAnsi="Times New Roman" w:cs="Times New Roman"/>
+          <w:sz w:val="24"/>
+          <w:szCs w:val="24"/>
+        </w:rPr>
+        <w:t xml:space="preserve"> Build the </w:t>
+      </w:r>
+      <w:r>
+        <w:rPr>
+          <w:rFonts w:ascii="Courier New" w:eastAsia="Times New Roman" w:hAnsi="Courier New" w:cs="Courier New"/>
+          <w:sz w:val="20"/>
+        </w:rPr>
+        <w:t>useChat.js</w:t>
+      </w:r>
+      <w:r>
+        <w:rPr>
+          <w:rFonts w:ascii="Times New Roman" w:eastAsia="Times New Roman" w:hAnsi="Times New Roman" w:cs="Times New Roman"/>
+          <w:sz w:val="24"/>
+          <w:szCs w:val="24"/>
+        </w:rPr>
+        <w:t xml:space="preserve"> custom hook to manage the back-and-forth polling and state management for the conversational agent.</w:t>
+      </w:r>
+    </w:p>
+    <w:p>
+      <w:pPr>
+        <w:numPr>
+          <w:ilvl w:val="0"/>
+          <w:numId w:val="19"/>
+        </w:numPr>
+        <w:spacing w:before="100" w:beforeAutospacing="1" w:after="100" w:afterAutospacing="1" w:line="240" w:lineRule="auto"/>
+        <w:rPr>
+          <w:rFonts w:ascii="Times New Roman" w:eastAsia="Times New Roman" w:hAnsi="Times New Roman" w:cs="Times New Roman"/>
+          <w:sz w:val="24"/>
+          <w:szCs w:val="24"/>
+        </w:rPr>
+      </w:pPr>
+      <w:r>
+        <w:rPr>
+          <w:rFonts w:ascii="Times New Roman" w:eastAsia="Times New Roman" w:hAnsi="Times New Roman" w:cs="Times New Roman"/>
+          <w:b/>
+          <w:bCs/>
+          <w:sz w:val="24"/>
+          <w:szCs w:val="24"/>
+        </w:rPr>
+        <w:t>Step 4: Session Views.</w:t>
+      </w:r>
+      <w:r>
+        <w:rPr>
+          <w:rFonts w:ascii="Times New Roman" w:eastAsia="Times New Roman" w:hAnsi="Times New Roman" w:cs="Times New Roman"/>
+          <w:sz w:val="24"/>
+          <w:szCs w:val="24"/>
+        </w:rPr>
+        <w:t xml:space="preserve"> Build the </w:t>
+      </w:r>
+      <w:r>
+        <w:rPr>
+          <w:rFonts w:ascii="Courier New" w:eastAsia="Times New Roman" w:hAnsi="Courier New" w:cs="Courier New"/>
+          <w:sz w:val="20"/>
+        </w:rPr>
+        <w:t>StudySessions.jsx</w:t>
+      </w:r>
+      <w:r>
+        <w:rPr>
+          <w:rFonts w:ascii="Times New Roman" w:eastAsia="Times New Roman" w:hAnsi="Times New Roman" w:cs="Times New Roman"/>
+          <w:sz w:val="24"/>
+          <w:szCs w:val="24"/>
+        </w:rPr>
+        <w:t xml:space="preserve"> (list view) and </w:t>
+      </w:r>
+      <w:r>
+        <w:rPr>
+          <w:rFonts w:ascii="Courier New" w:eastAsia="Times New Roman" w:hAnsi="Courier New" w:cs="Courier New"/>
+          <w:sz w:val="20"/>
+        </w:rPr>
+        <w:t>SessionDetail.jsx</w:t>
+      </w:r>
+      <w:r>
+        <w:rPr>
+          <w:rFonts w:ascii="Times New Roman" w:eastAsia="Times New Roman" w:hAnsi="Times New Roman" w:cs="Times New Roman"/>
+          <w:sz w:val="24"/>
+          <w:szCs w:val="24"/>
+        </w:rPr>
+        <w:t xml:space="preserve"> (the actual 60-page notes and chat window) to interact with the </w:t>
+      </w:r>
+      <w:r>
+        <w:rPr>
+          <w:rFonts w:ascii="Courier New" w:eastAsia="Times New Roman" w:hAnsi="Courier New" w:cs="Courier New"/>
+          <w:sz w:val="20"/>
+        </w:rPr>
+        <w:t>/</w:t>
+      </w:r>
+      <w:proofErr w:type="spellStart"/>
+      <w:r>
+        <w:rPr>
+          <w:rFonts w:ascii="Courier New" w:eastAsia="Times New Roman" w:hAnsi="Courier New" w:cs="Courier New"/>
+          <w:sz w:val="20"/>
+        </w:rPr>
+        <w:t>api</w:t>
+      </w:r>
+      <w:proofErr w:type="spellEnd"/>
+      <w:r>
+        <w:rPr>
+          <w:rFonts w:ascii="Courier New" w:eastAsia="Times New Roman" w:hAnsi="Courier New" w:cs="Courier New"/>
+          <w:sz w:val="20"/>
+        </w:rPr>
+        <w:t>/</w:t>
+      </w:r>
+      <w:proofErr w:type="spellStart"/>
+      <w:r>
+        <w:rPr>
+          <w:rFonts w:ascii="Courier New" w:eastAsia="Times New Roman" w:hAnsi="Courier New" w:cs="Courier New"/>
+          <w:sz w:val="20"/>
+        </w:rPr>
+        <w:t>youtube</w:t>
+      </w:r>
+      <w:proofErr w:type="spellEnd"/>
+      <w:r>
+        <w:rPr>
+          <w:rFonts w:ascii="Courier New" w:eastAsia="Times New Roman" w:hAnsi="Courier New" w:cs="Courier New"/>
+          <w:sz w:val="20"/>
+        </w:rPr>
+        <w:t>/chat</w:t>
+      </w:r>
+      <w:r>
+        <w:rPr>
+          <w:rFonts w:ascii="Times New Roman" w:eastAsia="Times New Roman" w:hAnsi="Times New Roman" w:cs="Times New Roman"/>
+          <w:sz w:val="24"/>
+          <w:szCs w:val="24"/>
+        </w:rPr>
+        <w:t xml:space="preserve"> and </w:t>
+      </w:r>
+      <w:r>
+        <w:rPr>
+          <w:rFonts w:ascii="Courier New" w:eastAsia="Times New Roman" w:hAnsi="Courier New" w:cs="Courier New"/>
+          <w:sz w:val="20"/>
+        </w:rPr>
+        <w:t>/</w:t>
+      </w:r>
+      <w:proofErr w:type="spellStart"/>
+      <w:r>
+        <w:rPr>
+          <w:rFonts w:ascii="Courier New" w:eastAsia="Times New Roman" w:hAnsi="Courier New" w:cs="Courier New"/>
+          <w:sz w:val="20"/>
+        </w:rPr>
+        <w:t>api</w:t>
+      </w:r>
+      <w:proofErr w:type="spellEnd"/>
+      <w:r>
+        <w:rPr>
+          <w:rFonts w:ascii="Courier New" w:eastAsia="Times New Roman" w:hAnsi="Courier New" w:cs="Courier New"/>
+          <w:sz w:val="20"/>
+        </w:rPr>
+        <w:t>/</w:t>
+      </w:r>
+      <w:proofErr w:type="spellStart"/>
+      <w:r>
+        <w:rPr>
+          <w:rFonts w:ascii="Courier New" w:eastAsia="Times New Roman" w:hAnsi="Courier New" w:cs="Courier New"/>
+          <w:sz w:val="20"/>
+        </w:rPr>
+        <w:t>youtube</w:t>
+      </w:r>
+      <w:proofErr w:type="spellEnd"/>
+      <w:r>
+        <w:rPr>
+          <w:rFonts w:ascii="Courier New" w:eastAsia="Times New Roman" w:hAnsi="Courier New" w:cs="Courier New"/>
+          <w:sz w:val="20"/>
+        </w:rPr>
+        <w:t>/detailed-notes</w:t>
+      </w:r>
+      <w:r>
+        <w:rPr>
+          <w:rFonts w:ascii="Times New Roman" w:eastAsia="Times New Roman" w:hAnsi="Times New Roman" w:cs="Times New Roman"/>
+          <w:sz w:val="24"/>
+          <w:szCs w:val="24"/>
+        </w:rPr>
+        <w:t xml:space="preserve"> endpoints.</w:t>
+      </w:r>
+    </w:p>
+    <w:p>
+      <w:pPr>
+        <w:spacing w:before="100" w:beforeAutospacing="1" w:after="100" w:afterAutospacing="1" w:line="240" w:lineRule="auto"/>
+        <w:outlineLvl w:val="2"/>
+        <w:rPr>
+          <w:rFonts w:ascii="Times New Roman" w:eastAsia="Times New Roman" w:hAnsi="Times New Roman" w:cs="Times New Roman"/>
+          <w:b/>
+          <w:bCs/>
+          <w:sz w:val="27"/>
+          <w:szCs w:val="27"/>
+        </w:rPr>
+      </w:pPr>
+      <w:r>
+        <w:rPr>
+          <w:rFonts w:ascii="Times New Roman" w:eastAsia="Times New Roman" w:hAnsi="Times New Roman" w:cs="Times New Roman"/>
+          <w:b/>
+          <w:bCs/>
+          <w:sz w:val="27"/>
+          <w:szCs w:val="27"/>
+        </w:rPr>
+        <w:t>Phase 4: Public Pages &amp; Polish</w:t>
+      </w:r>
+    </w:p>
+    <w:p>
+      <w:pPr>
+        <w:spacing w:before="100" w:beforeAutospacing="1" w:after="100" w:afterAutospacing="1" w:line="240" w:lineRule="auto"/>
+        <w:rPr>
+          <w:rFonts w:ascii="Times New Roman" w:eastAsia="Times New Roman" w:hAnsi="Times New Roman" w:cs="Times New Roman"/>
+          <w:sz w:val="24"/>
+          <w:szCs w:val="24"/>
+        </w:rPr>
+      </w:pPr>
+      <w:r>
+        <w:rPr>
+          <w:rFonts w:ascii="Times New Roman" w:eastAsia="Times New Roman" w:hAnsi="Times New Roman" w:cs="Times New Roman"/>
+          <w:sz w:val="24"/>
+          <w:szCs w:val="24"/>
+        </w:rPr>
+        <w:t>We wrap up the application by fixing the public face and ensuring enterprise-grade error handling.</w:t>
+      </w:r>
+    </w:p>
+    <w:p>
+      <w:pPr>
+        <w:numPr>
+          <w:ilvl w:val="0"/>
+          <w:numId w:val="20"/>
+        </w:numPr>
+        <w:spacing w:before="100" w:beforeAutospacing="1" w:after="100" w:afterAutospacing="1" w:line="240" w:lineRule="auto"/>
+        <w:rPr>
+          <w:rFonts w:ascii="Times New Roman" w:eastAsia="Times New Roman" w:hAnsi="Times New Roman" w:cs="Times New Roman"/>
+          <w:sz w:val="24"/>
+          <w:szCs w:val="24"/>
+        </w:rPr>
+      </w:pPr>
+      <w:r>
+        <w:rPr>
+          <w:rFonts w:ascii="Times New Roman" w:eastAsia="Times New Roman" w:hAnsi="Times New Roman" w:cs="Times New Roman"/>
+          <w:b/>
+          <w:bCs/>
+          <w:sz w:val="24"/>
+          <w:szCs w:val="24"/>
+        </w:rPr>
+        <w:t>Step 1: Public Routes.</w:t>
+      </w:r>
+      <w:r>
+        <w:rPr>
+          <w:rFonts w:ascii="Times New Roman" w:eastAsia="Times New Roman" w:hAnsi="Times New Roman" w:cs="Times New Roman"/>
+          <w:sz w:val="24"/>
+          <w:szCs w:val="24"/>
+        </w:rPr>
+        <w:t xml:space="preserve"> </w:t>
+      </w:r>
+      <w:proofErr w:type="gramStart"/>
+      <w:r>
+        <w:rPr>
+          <w:rFonts w:ascii="Times New Roman" w:eastAsia="Times New Roman" w:hAnsi="Times New Roman" w:cs="Times New Roman"/>
+          <w:sz w:val="24"/>
+          <w:szCs w:val="24"/>
+        </w:rPr>
+        <w:t>Migrate</w:t>
+      </w:r>
+      <w:proofErr w:type="gramEnd"/>
+      <w:r>
+        <w:rPr>
+          <w:rFonts w:ascii="Times New Roman" w:eastAsia="Times New Roman" w:hAnsi="Times New Roman" w:cs="Times New Roman"/>
+          <w:sz w:val="24"/>
+          <w:szCs w:val="24"/>
+        </w:rPr>
+        <w:t xml:space="preserve"> </w:t>
+      </w:r>
+      <w:r>
+        <w:rPr>
+          <w:rFonts w:ascii="Courier New" w:eastAsia="Times New Roman" w:hAnsi="Courier New" w:cs="Courier New"/>
+          <w:sz w:val="20"/>
+        </w:rPr>
+        <w:t>Home.jsx</w:t>
+      </w:r>
+      <w:r>
+        <w:rPr>
+          <w:rFonts w:ascii="Times New Roman" w:eastAsia="Times New Roman" w:hAnsi="Times New Roman" w:cs="Times New Roman"/>
+          <w:sz w:val="24"/>
+          <w:szCs w:val="24"/>
+        </w:rPr>
+        <w:t xml:space="preserve">, </w:t>
+      </w:r>
+      <w:r>
+        <w:rPr>
+          <w:rFonts w:ascii="Courier New" w:eastAsia="Times New Roman" w:hAnsi="Courier New" w:cs="Courier New"/>
+          <w:sz w:val="20"/>
+        </w:rPr>
+        <w:t>Hero.jsx</w:t>
+      </w:r>
+      <w:r>
+        <w:rPr>
+          <w:rFonts w:ascii="Times New Roman" w:eastAsia="Times New Roman" w:hAnsi="Times New Roman" w:cs="Times New Roman"/>
+          <w:sz w:val="24"/>
+          <w:szCs w:val="24"/>
+        </w:rPr>
+        <w:t xml:space="preserve">, </w:t>
+      </w:r>
+      <w:r>
+        <w:rPr>
+          <w:rFonts w:ascii="Courier New" w:eastAsia="Times New Roman" w:hAnsi="Courier New" w:cs="Courier New"/>
+          <w:sz w:val="20"/>
+        </w:rPr>
+        <w:t>Testimonial.jsx</w:t>
+      </w:r>
+      <w:r>
+        <w:rPr>
+          <w:rFonts w:ascii="Times New Roman" w:eastAsia="Times New Roman" w:hAnsi="Times New Roman" w:cs="Times New Roman"/>
+          <w:sz w:val="24"/>
+          <w:szCs w:val="24"/>
+        </w:rPr>
+        <w:t>, and any other landing page components.</w:t>
+      </w:r>
+    </w:p>
+    <w:p>
+      <w:pPr>
+        <w:numPr>
+          <w:ilvl w:val="0"/>
+          <w:numId w:val="20"/>
+        </w:numPr>
+        <w:spacing w:before="100" w:beforeAutospacing="1" w:after="100" w:afterAutospacing="1" w:line="240" w:lineRule="auto"/>
+        <w:rPr>
+          <w:rFonts w:ascii="Times New Roman" w:eastAsia="Times New Roman" w:hAnsi="Times New Roman" w:cs="Times New Roman"/>
+          <w:sz w:val="24"/>
+          <w:szCs w:val="24"/>
+        </w:rPr>
+      </w:pPr>
+      <w:r>
+        <w:rPr>
+          <w:rFonts w:ascii="Times New Roman" w:eastAsia="Times New Roman" w:hAnsi="Times New Roman" w:cs="Times New Roman"/>
+          <w:b/>
+          <w:bCs/>
+          <w:sz w:val="24"/>
+          <w:szCs w:val="24"/>
+        </w:rPr>
+        <w:t>Step 2: Global Polish.</w:t>
+      </w:r>
+      <w:r>
+        <w:rPr>
+          <w:rFonts w:ascii="Times New Roman" w:eastAsia="Times New Roman" w:hAnsi="Times New Roman" w:cs="Times New Roman"/>
+          <w:sz w:val="24"/>
+          <w:szCs w:val="24"/>
+        </w:rPr>
+        <w:t xml:space="preserve"> Ensure </w:t>
+      </w:r>
+      <w:r>
+        <w:rPr>
+          <w:rFonts w:ascii="Courier New" w:eastAsia="Times New Roman" w:hAnsi="Courier New" w:cs="Courier New"/>
+          <w:sz w:val="20"/>
+        </w:rPr>
+        <w:t>react-hot-toast</w:t>
+      </w:r>
+      <w:r>
+        <w:rPr>
+          <w:rFonts w:ascii="Times New Roman" w:eastAsia="Times New Roman" w:hAnsi="Times New Roman" w:cs="Times New Roman"/>
+          <w:sz w:val="24"/>
+          <w:szCs w:val="24"/>
+        </w:rPr>
+        <w:t xml:space="preserve"> is catching all </w:t>
+      </w:r>
+      <w:proofErr w:type="spellStart"/>
+      <w:r>
+        <w:rPr>
+          <w:rFonts w:ascii="Times New Roman" w:eastAsia="Times New Roman" w:hAnsi="Times New Roman" w:cs="Times New Roman"/>
+          <w:sz w:val="24"/>
+          <w:szCs w:val="24"/>
+        </w:rPr>
+        <w:t>Axios</w:t>
+      </w:r>
+      <w:proofErr w:type="spellEnd"/>
+      <w:r>
+        <w:rPr>
+          <w:rFonts w:ascii="Times New Roman" w:eastAsia="Times New Roman" w:hAnsi="Times New Roman" w:cs="Times New Roman"/>
+          <w:sz w:val="24"/>
+          <w:szCs w:val="24"/>
+        </w:rPr>
+        <w:t xml:space="preserve"> interceptor errors smoothly, verify responsive design on mobile, and finalize the code for deployment.</w:t>
+      </w:r>
+    </w:p>
+    <w:p/>
+    <w:p>
       <w:r>
         <w:rPr>
           <w:noProof/>
         </w:rPr>
+        <w:lastRenderedPageBreak/>
         <w:pict>
           <v:shape id="_x0000_s1028" type="#_x0000_t32" style="position:absolute;margin-left:-63.25pt;margin-top:11.6pt;width:599.3pt;height:1.65pt;flip:y;z-index:251660288" o:connectortype="straight"/>
         </w:pict>
@@ -4672,6 +6041,155 @@
     </w:lvl>
   </w:abstractNum>
   <w:abstractNum w:abstractNumId="2">
+    <w:nsid w:val="07E51C6D"/>
+    <w:multiLevelType w:val="multilevel"/>
+    <w:tmpl w:val="80D614E0"/>
+    <w:lvl w:ilvl="0">
+      <w:start w:val="1"/>
+      <w:numFmt w:val="bullet"/>
+      <w:lvlText w:val=""/>
+      <w:lvlJc w:val="left"/>
+      <w:pPr>
+        <w:tabs>
+          <w:tab w:val="num" w:pos="720"/>
+        </w:tabs>
+        <w:ind w:left="720" w:hanging="360"/>
+      </w:pPr>
+      <w:rPr>
+        <w:rFonts w:ascii="Symbol" w:hAnsi="Symbol" w:hint="default"/>
+        <w:sz w:val="20"/>
+      </w:rPr>
+    </w:lvl>
+    <w:lvl w:ilvl="1" w:tentative="1">
+      <w:start w:val="1"/>
+      <w:numFmt w:val="bullet"/>
+      <w:lvlText w:val="o"/>
+      <w:lvlJc w:val="left"/>
+      <w:pPr>
+        <w:tabs>
+          <w:tab w:val="num" w:pos="1440"/>
+        </w:tabs>
+        <w:ind w:left="1440" w:hanging="360"/>
+      </w:pPr>
+      <w:rPr>
+        <w:rFonts w:ascii="Courier New" w:hAnsi="Courier New" w:hint="default"/>
+        <w:sz w:val="20"/>
+      </w:rPr>
+    </w:lvl>
+    <w:lvl w:ilvl="2" w:tentative="1">
+      <w:start w:val="1"/>
+      <w:numFmt w:val="bullet"/>
+      <w:lvlText w:val=""/>
+      <w:lvlJc w:val="left"/>
+      <w:pPr>
+        <w:tabs>
+          <w:tab w:val="num" w:pos="2160"/>
+        </w:tabs>
+        <w:ind w:left="2160" w:hanging="360"/>
+      </w:pPr>
+      <w:rPr>
+        <w:rFonts w:ascii="Wingdings" w:hAnsi="Wingdings" w:hint="default"/>
+        <w:sz w:val="20"/>
+      </w:rPr>
+    </w:lvl>
+    <w:lvl w:ilvl="3" w:tentative="1">
+      <w:start w:val="1"/>
+      <w:numFmt w:val="bullet"/>
+      <w:lvlText w:val=""/>
+      <w:lvlJc w:val="left"/>
+      <w:pPr>
+        <w:tabs>
+          <w:tab w:val="num" w:pos="2880"/>
+        </w:tabs>
+        <w:ind w:left="2880" w:hanging="360"/>
+      </w:pPr>
+      <w:rPr>
+        <w:rFonts w:ascii="Wingdings" w:hAnsi="Wingdings" w:hint="default"/>
+        <w:sz w:val="20"/>
+      </w:rPr>
+    </w:lvl>
+    <w:lvl w:ilvl="4" w:tentative="1">
+      <w:start w:val="1"/>
+      <w:numFmt w:val="bullet"/>
+      <w:lvlText w:val=""/>
+      <w:lvlJc w:val="left"/>
+      <w:pPr>
+        <w:tabs>
+          <w:tab w:val="num" w:pos="3600"/>
+        </w:tabs>
+        <w:ind w:left="3600" w:hanging="360"/>
+      </w:pPr>
+      <w:rPr>
+        <w:rFonts w:ascii="Wingdings" w:hAnsi="Wingdings" w:hint="default"/>
+        <w:sz w:val="20"/>
+      </w:rPr>
+    </w:lvl>
+    <w:lvl w:ilvl="5" w:tentative="1">
+      <w:start w:val="1"/>
+      <w:numFmt w:val="bullet"/>
+      <w:lvlText w:val=""/>
+      <w:lvlJc w:val="left"/>
+      <w:pPr>
+        <w:tabs>
+          <w:tab w:val="num" w:pos="4320"/>
+        </w:tabs>
+        <w:ind w:left="4320" w:hanging="360"/>
+      </w:pPr>
+      <w:rPr>
+        <w:rFonts w:ascii="Wingdings" w:hAnsi="Wingdings" w:hint="default"/>
+        <w:sz w:val="20"/>
+      </w:rPr>
+    </w:lvl>
+    <w:lvl w:ilvl="6" w:tentative="1">
+      <w:start w:val="1"/>
+      <w:numFmt w:val="bullet"/>
+      <w:lvlText w:val=""/>
+      <w:lvlJc w:val="left"/>
+      <w:pPr>
+        <w:tabs>
+          <w:tab w:val="num" w:pos="5040"/>
+        </w:tabs>
+        <w:ind w:left="5040" w:hanging="360"/>
+      </w:pPr>
+      <w:rPr>
+        <w:rFonts w:ascii="Wingdings" w:hAnsi="Wingdings" w:hint="default"/>
+        <w:sz w:val="20"/>
+      </w:rPr>
+    </w:lvl>
+    <w:lvl w:ilvl="7" w:tentative="1">
+      <w:start w:val="1"/>
+      <w:numFmt w:val="bullet"/>
+      <w:lvlText w:val=""/>
+      <w:lvlJc w:val="left"/>
+      <w:pPr>
+        <w:tabs>
+          <w:tab w:val="num" w:pos="5760"/>
+        </w:tabs>
+        <w:ind w:left="5760" w:hanging="360"/>
+      </w:pPr>
+      <w:rPr>
+        <w:rFonts w:ascii="Wingdings" w:hAnsi="Wingdings" w:hint="default"/>
+        <w:sz w:val="20"/>
+      </w:rPr>
+    </w:lvl>
+    <w:lvl w:ilvl="8" w:tentative="1">
+      <w:start w:val="1"/>
+      <w:numFmt w:val="bullet"/>
+      <w:lvlText w:val=""/>
+      <w:lvlJc w:val="left"/>
+      <w:pPr>
+        <w:tabs>
+          <w:tab w:val="num" w:pos="6480"/>
+        </w:tabs>
+        <w:ind w:left="6480" w:hanging="360"/>
+      </w:pPr>
+      <w:rPr>
+        <w:rFonts w:ascii="Wingdings" w:hAnsi="Wingdings" w:hint="default"/>
+        <w:sz w:val="20"/>
+      </w:rPr>
+    </w:lvl>
+  </w:abstractNum>
+  <w:abstractNum w:abstractNumId="3">
     <w:nsid w:val="0A4F2660"/>
     <w:multiLevelType w:val="multilevel"/>
     <w:tmpl w:val="B2CCBBEE"/>
@@ -4820,7 +6338,7 @@
       </w:rPr>
     </w:lvl>
   </w:abstractNum>
-  <w:abstractNum w:abstractNumId="3">
+  <w:abstractNum w:abstractNumId="4">
     <w:nsid w:val="0B9911AC"/>
     <w:multiLevelType w:val="multilevel"/>
     <w:tmpl w:val="433CD37E"/>
@@ -4969,7 +6487,305 @@
       </w:rPr>
     </w:lvl>
   </w:abstractNum>
-  <w:abstractNum w:abstractNumId="4">
+  <w:abstractNum w:abstractNumId="5">
+    <w:nsid w:val="0F490C0A"/>
+    <w:multiLevelType w:val="multilevel"/>
+    <w:tmpl w:val="07EC47C6"/>
+    <w:lvl w:ilvl="0">
+      <w:start w:val="1"/>
+      <w:numFmt w:val="bullet"/>
+      <w:lvlText w:val=""/>
+      <w:lvlJc w:val="left"/>
+      <w:pPr>
+        <w:tabs>
+          <w:tab w:val="num" w:pos="720"/>
+        </w:tabs>
+        <w:ind w:left="720" w:hanging="360"/>
+      </w:pPr>
+      <w:rPr>
+        <w:rFonts w:ascii="Symbol" w:hAnsi="Symbol" w:hint="default"/>
+        <w:sz w:val="20"/>
+      </w:rPr>
+    </w:lvl>
+    <w:lvl w:ilvl="1" w:tentative="1">
+      <w:start w:val="1"/>
+      <w:numFmt w:val="bullet"/>
+      <w:lvlText w:val="o"/>
+      <w:lvlJc w:val="left"/>
+      <w:pPr>
+        <w:tabs>
+          <w:tab w:val="num" w:pos="1440"/>
+        </w:tabs>
+        <w:ind w:left="1440" w:hanging="360"/>
+      </w:pPr>
+      <w:rPr>
+        <w:rFonts w:ascii="Courier New" w:hAnsi="Courier New" w:hint="default"/>
+        <w:sz w:val="20"/>
+      </w:rPr>
+    </w:lvl>
+    <w:lvl w:ilvl="2" w:tentative="1">
+      <w:start w:val="1"/>
+      <w:numFmt w:val="bullet"/>
+      <w:lvlText w:val=""/>
+      <w:lvlJc w:val="left"/>
+      <w:pPr>
+        <w:tabs>
+          <w:tab w:val="num" w:pos="2160"/>
+        </w:tabs>
+        <w:ind w:left="2160" w:hanging="360"/>
+      </w:pPr>
+      <w:rPr>
+        <w:rFonts w:ascii="Wingdings" w:hAnsi="Wingdings" w:hint="default"/>
+        <w:sz w:val="20"/>
+      </w:rPr>
+    </w:lvl>
+    <w:lvl w:ilvl="3" w:tentative="1">
+      <w:start w:val="1"/>
+      <w:numFmt w:val="bullet"/>
+      <w:lvlText w:val=""/>
+      <w:lvlJc w:val="left"/>
+      <w:pPr>
+        <w:tabs>
+          <w:tab w:val="num" w:pos="2880"/>
+        </w:tabs>
+        <w:ind w:left="2880" w:hanging="360"/>
+      </w:pPr>
+      <w:rPr>
+        <w:rFonts w:ascii="Wingdings" w:hAnsi="Wingdings" w:hint="default"/>
+        <w:sz w:val="20"/>
+      </w:rPr>
+    </w:lvl>
+    <w:lvl w:ilvl="4" w:tentative="1">
+      <w:start w:val="1"/>
+      <w:numFmt w:val="bullet"/>
+      <w:lvlText w:val=""/>
+      <w:lvlJc w:val="left"/>
+      <w:pPr>
+        <w:tabs>
+          <w:tab w:val="num" w:pos="3600"/>
+        </w:tabs>
+        <w:ind w:left="3600" w:hanging="360"/>
+      </w:pPr>
+      <w:rPr>
+        <w:rFonts w:ascii="Wingdings" w:hAnsi="Wingdings" w:hint="default"/>
+        <w:sz w:val="20"/>
+      </w:rPr>
+    </w:lvl>
+    <w:lvl w:ilvl="5" w:tentative="1">
+      <w:start w:val="1"/>
+      <w:numFmt w:val="bullet"/>
+      <w:lvlText w:val=""/>
+      <w:lvlJc w:val="left"/>
+      <w:pPr>
+        <w:tabs>
+          <w:tab w:val="num" w:pos="4320"/>
+        </w:tabs>
+        <w:ind w:left="4320" w:hanging="360"/>
+      </w:pPr>
+      <w:rPr>
+        <w:rFonts w:ascii="Wingdings" w:hAnsi="Wingdings" w:hint="default"/>
+        <w:sz w:val="20"/>
+      </w:rPr>
+    </w:lvl>
+    <w:lvl w:ilvl="6" w:tentative="1">
+      <w:start w:val="1"/>
+      <w:numFmt w:val="bullet"/>
+      <w:lvlText w:val=""/>
+      <w:lvlJc w:val="left"/>
+      <w:pPr>
+        <w:tabs>
+          <w:tab w:val="num" w:pos="5040"/>
+        </w:tabs>
+        <w:ind w:left="5040" w:hanging="360"/>
+      </w:pPr>
+      <w:rPr>
+        <w:rFonts w:ascii="Wingdings" w:hAnsi="Wingdings" w:hint="default"/>
+        <w:sz w:val="20"/>
+      </w:rPr>
+    </w:lvl>
+    <w:lvl w:ilvl="7" w:tentative="1">
+      <w:start w:val="1"/>
+      <w:numFmt w:val="bullet"/>
+      <w:lvlText w:val=""/>
+      <w:lvlJc w:val="left"/>
+      <w:pPr>
+        <w:tabs>
+          <w:tab w:val="num" w:pos="5760"/>
+        </w:tabs>
+        <w:ind w:left="5760" w:hanging="360"/>
+      </w:pPr>
+      <w:rPr>
+        <w:rFonts w:ascii="Wingdings" w:hAnsi="Wingdings" w:hint="default"/>
+        <w:sz w:val="20"/>
+      </w:rPr>
+    </w:lvl>
+    <w:lvl w:ilvl="8" w:tentative="1">
+      <w:start w:val="1"/>
+      <w:numFmt w:val="bullet"/>
+      <w:lvlText w:val=""/>
+      <w:lvlJc w:val="left"/>
+      <w:pPr>
+        <w:tabs>
+          <w:tab w:val="num" w:pos="6480"/>
+        </w:tabs>
+        <w:ind w:left="6480" w:hanging="360"/>
+      </w:pPr>
+      <w:rPr>
+        <w:rFonts w:ascii="Wingdings" w:hAnsi="Wingdings" w:hint="default"/>
+        <w:sz w:val="20"/>
+      </w:rPr>
+    </w:lvl>
+  </w:abstractNum>
+  <w:abstractNum w:abstractNumId="6">
+    <w:nsid w:val="11DB2358"/>
+    <w:multiLevelType w:val="multilevel"/>
+    <w:tmpl w:val="64E28EDC"/>
+    <w:lvl w:ilvl="0">
+      <w:start w:val="1"/>
+      <w:numFmt w:val="bullet"/>
+      <w:lvlText w:val=""/>
+      <w:lvlJc w:val="left"/>
+      <w:pPr>
+        <w:tabs>
+          <w:tab w:val="num" w:pos="720"/>
+        </w:tabs>
+        <w:ind w:left="720" w:hanging="360"/>
+      </w:pPr>
+      <w:rPr>
+        <w:rFonts w:ascii="Symbol" w:hAnsi="Symbol" w:hint="default"/>
+        <w:sz w:val="20"/>
+      </w:rPr>
+    </w:lvl>
+    <w:lvl w:ilvl="1" w:tentative="1">
+      <w:start w:val="1"/>
+      <w:numFmt w:val="bullet"/>
+      <w:lvlText w:val="o"/>
+      <w:lvlJc w:val="left"/>
+      <w:pPr>
+        <w:tabs>
+          <w:tab w:val="num" w:pos="1440"/>
+        </w:tabs>
+        <w:ind w:left="1440" w:hanging="360"/>
+      </w:pPr>
+      <w:rPr>
+        <w:rFonts w:ascii="Courier New" w:hAnsi="Courier New" w:hint="default"/>
+        <w:sz w:val="20"/>
+      </w:rPr>
+    </w:lvl>
+    <w:lvl w:ilvl="2" w:tentative="1">
+      <w:start w:val="1"/>
+      <w:numFmt w:val="bullet"/>
+      <w:lvlText w:val=""/>
+      <w:lvlJc w:val="left"/>
+      <w:pPr>
+        <w:tabs>
+          <w:tab w:val="num" w:pos="2160"/>
+        </w:tabs>
+        <w:ind w:left="2160" w:hanging="360"/>
+      </w:pPr>
+      <w:rPr>
+        <w:rFonts w:ascii="Wingdings" w:hAnsi="Wingdings" w:hint="default"/>
+        <w:sz w:val="20"/>
+      </w:rPr>
+    </w:lvl>
+    <w:lvl w:ilvl="3" w:tentative="1">
+      <w:start w:val="1"/>
+      <w:numFmt w:val="bullet"/>
+      <w:lvlText w:val=""/>
+      <w:lvlJc w:val="left"/>
+      <w:pPr>
+        <w:tabs>
+          <w:tab w:val="num" w:pos="2880"/>
+        </w:tabs>
+        <w:ind w:left="2880" w:hanging="360"/>
+      </w:pPr>
+      <w:rPr>
+        <w:rFonts w:ascii="Wingdings" w:hAnsi="Wingdings" w:hint="default"/>
+        <w:sz w:val="20"/>
+      </w:rPr>
+    </w:lvl>
+    <w:lvl w:ilvl="4" w:tentative="1">
+      <w:start w:val="1"/>
+      <w:numFmt w:val="bullet"/>
+      <w:lvlText w:val=""/>
+      <w:lvlJc w:val="left"/>
+      <w:pPr>
+        <w:tabs>
+          <w:tab w:val="num" w:pos="3600"/>
+        </w:tabs>
+        <w:ind w:left="3600" w:hanging="360"/>
+      </w:pPr>
+      <w:rPr>
+        <w:rFonts w:ascii="Wingdings" w:hAnsi="Wingdings" w:hint="default"/>
+        <w:sz w:val="20"/>
+      </w:rPr>
+    </w:lvl>
+    <w:lvl w:ilvl="5" w:tentative="1">
+      <w:start w:val="1"/>
+      <w:numFmt w:val="bullet"/>
+      <w:lvlText w:val=""/>
+      <w:lvlJc w:val="left"/>
+      <w:pPr>
+        <w:tabs>
+          <w:tab w:val="num" w:pos="4320"/>
+        </w:tabs>
+        <w:ind w:left="4320" w:hanging="360"/>
+      </w:pPr>
+      <w:rPr>
+        <w:rFonts w:ascii="Wingdings" w:hAnsi="Wingdings" w:hint="default"/>
+        <w:sz w:val="20"/>
+      </w:rPr>
+    </w:lvl>
+    <w:lvl w:ilvl="6" w:tentative="1">
+      <w:start w:val="1"/>
+      <w:numFmt w:val="bullet"/>
+      <w:lvlText w:val=""/>
+      <w:lvlJc w:val="left"/>
+      <w:pPr>
+        <w:tabs>
+          <w:tab w:val="num" w:pos="5040"/>
+        </w:tabs>
+        <w:ind w:left="5040" w:hanging="360"/>
+      </w:pPr>
+      <w:rPr>
+        <w:rFonts w:ascii="Wingdings" w:hAnsi="Wingdings" w:hint="default"/>
+        <w:sz w:val="20"/>
+      </w:rPr>
+    </w:lvl>
+    <w:lvl w:ilvl="7" w:tentative="1">
+      <w:start w:val="1"/>
+      <w:numFmt w:val="bullet"/>
+      <w:lvlText w:val=""/>
+      <w:lvlJc w:val="left"/>
+      <w:pPr>
+        <w:tabs>
+          <w:tab w:val="num" w:pos="5760"/>
+        </w:tabs>
+        <w:ind w:left="5760" w:hanging="360"/>
+      </w:pPr>
+      <w:rPr>
+        <w:rFonts w:ascii="Wingdings" w:hAnsi="Wingdings" w:hint="default"/>
+        <w:sz w:val="20"/>
+      </w:rPr>
+    </w:lvl>
+    <w:lvl w:ilvl="8" w:tentative="1">
+      <w:start w:val="1"/>
+      <w:numFmt w:val="bullet"/>
+      <w:lvlText w:val=""/>
+      <w:lvlJc w:val="left"/>
+      <w:pPr>
+        <w:tabs>
+          <w:tab w:val="num" w:pos="6480"/>
+        </w:tabs>
+        <w:ind w:left="6480" w:hanging="360"/>
+      </w:pPr>
+      <w:rPr>
+        <w:rFonts w:ascii="Wingdings" w:hAnsi="Wingdings" w:hint="default"/>
+        <w:sz w:val="20"/>
+      </w:rPr>
+    </w:lvl>
+  </w:abstractNum>
+  <w:abstractNum w:abstractNumId="7">
     <w:nsid w:val="12CE1496"/>
     <w:multiLevelType w:val="multilevel"/>
     <w:tmpl w:val="E2F672F6"/>
@@ -5118,7 +6934,7 @@
       </w:rPr>
     </w:lvl>
   </w:abstractNum>
-  <w:abstractNum w:abstractNumId="5">
+  <w:abstractNum w:abstractNumId="8">
     <w:nsid w:val="20767C0C"/>
     <w:multiLevelType w:val="multilevel"/>
     <w:tmpl w:val="43265732"/>
@@ -5267,7 +7083,7 @@
       </w:rPr>
     </w:lvl>
   </w:abstractNum>
-  <w:abstractNum w:abstractNumId="6">
+  <w:abstractNum w:abstractNumId="9">
     <w:nsid w:val="24DD5D1D"/>
     <w:multiLevelType w:val="multilevel"/>
     <w:tmpl w:val="C2362B6C"/>
@@ -5416,7 +7232,7 @@
       </w:rPr>
     </w:lvl>
   </w:abstractNum>
-  <w:abstractNum w:abstractNumId="7">
+  <w:abstractNum w:abstractNumId="10">
     <w:nsid w:val="252E0C1C"/>
     <w:multiLevelType w:val="multilevel"/>
     <w:tmpl w:val="639CD376"/>
@@ -5565,7 +7381,7 @@
       </w:rPr>
     </w:lvl>
   </w:abstractNum>
-  <w:abstractNum w:abstractNumId="8">
+  <w:abstractNum w:abstractNumId="11">
     <w:nsid w:val="2DD509DA"/>
     <w:multiLevelType w:val="multilevel"/>
     <w:tmpl w:val="491ADD2A"/>
@@ -5714,7 +7530,7 @@
       </w:rPr>
     </w:lvl>
   </w:abstractNum>
-  <w:abstractNum w:abstractNumId="9">
+  <w:abstractNum w:abstractNumId="12">
     <w:nsid w:val="328676A0"/>
     <w:multiLevelType w:val="multilevel"/>
     <w:tmpl w:val="6C36B316"/>
@@ -5863,7 +7679,7 @@
       </w:rPr>
     </w:lvl>
   </w:abstractNum>
-  <w:abstractNum w:abstractNumId="10">
+  <w:abstractNum w:abstractNumId="13">
     <w:nsid w:val="3ACE2E86"/>
     <w:multiLevelType w:val="multilevel"/>
     <w:tmpl w:val="31EA3CF8"/>
@@ -6012,7 +7828,7 @@
       </w:rPr>
     </w:lvl>
   </w:abstractNum>
-  <w:abstractNum w:abstractNumId="11">
+  <w:abstractNum w:abstractNumId="14">
     <w:nsid w:val="3D423E30"/>
     <w:multiLevelType w:val="multilevel"/>
     <w:tmpl w:val="1376D9DA"/>
@@ -6161,7 +7977,7 @@
       </w:rPr>
     </w:lvl>
   </w:abstractNum>
-  <w:abstractNum w:abstractNumId="12">
+  <w:abstractNum w:abstractNumId="15">
     <w:nsid w:val="60804E5F"/>
     <w:multiLevelType w:val="multilevel"/>
     <w:tmpl w:val="B02E550A"/>
@@ -6310,7 +8126,7 @@
       </w:rPr>
     </w:lvl>
   </w:abstractNum>
-  <w:abstractNum w:abstractNumId="13">
+  <w:abstractNum w:abstractNumId="16">
     <w:nsid w:val="62A645C5"/>
     <w:multiLevelType w:val="multilevel"/>
     <w:tmpl w:val="B754899A"/>
@@ -6459,7 +8275,156 @@
       </w:rPr>
     </w:lvl>
   </w:abstractNum>
-  <w:abstractNum w:abstractNumId="14">
+  <w:abstractNum w:abstractNumId="17">
+    <w:nsid w:val="663254EE"/>
+    <w:multiLevelType w:val="multilevel"/>
+    <w:tmpl w:val="08D8C0C8"/>
+    <w:lvl w:ilvl="0">
+      <w:start w:val="1"/>
+      <w:numFmt w:val="bullet"/>
+      <w:lvlText w:val=""/>
+      <w:lvlJc w:val="left"/>
+      <w:pPr>
+        <w:tabs>
+          <w:tab w:val="num" w:pos="720"/>
+        </w:tabs>
+        <w:ind w:left="720" w:hanging="360"/>
+      </w:pPr>
+      <w:rPr>
+        <w:rFonts w:ascii="Symbol" w:hAnsi="Symbol" w:hint="default"/>
+        <w:sz w:val="20"/>
+      </w:rPr>
+    </w:lvl>
+    <w:lvl w:ilvl="1" w:tentative="1">
+      <w:start w:val="1"/>
+      <w:numFmt w:val="bullet"/>
+      <w:lvlText w:val="o"/>
+      <w:lvlJc w:val="left"/>
+      <w:pPr>
+        <w:tabs>
+          <w:tab w:val="num" w:pos="1440"/>
+        </w:tabs>
+        <w:ind w:left="1440" w:hanging="360"/>
+      </w:pPr>
+      <w:rPr>
+        <w:rFonts w:ascii="Courier New" w:hAnsi="Courier New" w:hint="default"/>
+        <w:sz w:val="20"/>
+      </w:rPr>
+    </w:lvl>
+    <w:lvl w:ilvl="2" w:tentative="1">
+      <w:start w:val="1"/>
+      <w:numFmt w:val="bullet"/>
+      <w:lvlText w:val=""/>
+      <w:lvlJc w:val="left"/>
+      <w:pPr>
+        <w:tabs>
+          <w:tab w:val="num" w:pos="2160"/>
+        </w:tabs>
+        <w:ind w:left="2160" w:hanging="360"/>
+      </w:pPr>
+      <w:rPr>
+        <w:rFonts w:ascii="Wingdings" w:hAnsi="Wingdings" w:hint="default"/>
+        <w:sz w:val="20"/>
+      </w:rPr>
+    </w:lvl>
+    <w:lvl w:ilvl="3" w:tentative="1">
+      <w:start w:val="1"/>
+      <w:numFmt w:val="bullet"/>
+      <w:lvlText w:val=""/>
+      <w:lvlJc w:val="left"/>
+      <w:pPr>
+        <w:tabs>
+          <w:tab w:val="num" w:pos="2880"/>
+        </w:tabs>
+        <w:ind w:left="2880" w:hanging="360"/>
+      </w:pPr>
+      <w:rPr>
+        <w:rFonts w:ascii="Wingdings" w:hAnsi="Wingdings" w:hint="default"/>
+        <w:sz w:val="20"/>
+      </w:rPr>
+    </w:lvl>
+    <w:lvl w:ilvl="4" w:tentative="1">
+      <w:start w:val="1"/>
+      <w:numFmt w:val="bullet"/>
+      <w:lvlText w:val=""/>
+      <w:lvlJc w:val="left"/>
+      <w:pPr>
+        <w:tabs>
+          <w:tab w:val="num" w:pos="3600"/>
+        </w:tabs>
+        <w:ind w:left="3600" w:hanging="360"/>
+      </w:pPr>
+      <w:rPr>
+        <w:rFonts w:ascii="Wingdings" w:hAnsi="Wingdings" w:hint="default"/>
+        <w:sz w:val="20"/>
+      </w:rPr>
+    </w:lvl>
+    <w:lvl w:ilvl="5" w:tentative="1">
+      <w:start w:val="1"/>
+      <w:numFmt w:val="bullet"/>
+      <w:lvlText w:val=""/>
+      <w:lvlJc w:val="left"/>
+      <w:pPr>
+        <w:tabs>
+          <w:tab w:val="num" w:pos="4320"/>
+        </w:tabs>
+        <w:ind w:left="4320" w:hanging="360"/>
+      </w:pPr>
+      <w:rPr>
+        <w:rFonts w:ascii="Wingdings" w:hAnsi="Wingdings" w:hint="default"/>
+        <w:sz w:val="20"/>
+      </w:rPr>
+    </w:lvl>
+    <w:lvl w:ilvl="6" w:tentative="1">
+      <w:start w:val="1"/>
+      <w:numFmt w:val="bullet"/>
+      <w:lvlText w:val=""/>
+      <w:lvlJc w:val="left"/>
+      <w:pPr>
+        <w:tabs>
+          <w:tab w:val="num" w:pos="5040"/>
+        </w:tabs>
+        <w:ind w:left="5040" w:hanging="360"/>
+      </w:pPr>
+      <w:rPr>
+        <w:rFonts w:ascii="Wingdings" w:hAnsi="Wingdings" w:hint="default"/>
+        <w:sz w:val="20"/>
+      </w:rPr>
+    </w:lvl>
+    <w:lvl w:ilvl="7" w:tentative="1">
+      <w:start w:val="1"/>
+      <w:numFmt w:val="bullet"/>
+      <w:lvlText w:val=""/>
+      <w:lvlJc w:val="left"/>
+      <w:pPr>
+        <w:tabs>
+          <w:tab w:val="num" w:pos="5760"/>
+        </w:tabs>
+        <w:ind w:left="5760" w:hanging="360"/>
+      </w:pPr>
+      <w:rPr>
+        <w:rFonts w:ascii="Wingdings" w:hAnsi="Wingdings" w:hint="default"/>
+        <w:sz w:val="20"/>
+      </w:rPr>
+    </w:lvl>
+    <w:lvl w:ilvl="8" w:tentative="1">
+      <w:start w:val="1"/>
+      <w:numFmt w:val="bullet"/>
+      <w:lvlText w:val=""/>
+      <w:lvlJc w:val="left"/>
+      <w:pPr>
+        <w:tabs>
+          <w:tab w:val="num" w:pos="6480"/>
+        </w:tabs>
+        <w:ind w:left="6480" w:hanging="360"/>
+      </w:pPr>
+      <w:rPr>
+        <w:rFonts w:ascii="Wingdings" w:hAnsi="Wingdings" w:hint="default"/>
+        <w:sz w:val="20"/>
+      </w:rPr>
+    </w:lvl>
+  </w:abstractNum>
+  <w:abstractNum w:abstractNumId="18">
     <w:nsid w:val="77BF22E1"/>
     <w:multiLevelType w:val="multilevel"/>
     <w:tmpl w:val="79124920"/>
@@ -6608,7 +8573,7 @@
       </w:rPr>
     </w:lvl>
   </w:abstractNum>
-  <w:abstractNum w:abstractNumId="15">
+  <w:abstractNum w:abstractNumId="19">
     <w:nsid w:val="79242042"/>
     <w:multiLevelType w:val="multilevel"/>
     <w:tmpl w:val="5ACCC718"/>
@@ -6758,52 +8723,64 @@
     </w:lvl>
   </w:abstractNum>
   <w:num w:numId="1">
+    <w:abstractNumId w:val="19"/>
+  </w:num>
+  <w:num w:numId="2">
+    <w:abstractNumId w:val="13"/>
+  </w:num>
+  <w:num w:numId="3">
+    <w:abstractNumId w:val="12"/>
+  </w:num>
+  <w:num w:numId="4">
     <w:abstractNumId w:val="15"/>
   </w:num>
-  <w:num w:numId="2">
-    <w:abstractNumId w:val="10"/>
-  </w:num>
-  <w:num w:numId="3">
-    <w:abstractNumId w:val="9"/>
-  </w:num>
-  <w:num w:numId="4">
-    <w:abstractNumId w:val="12"/>
-  </w:num>
   <w:num w:numId="5">
-    <w:abstractNumId w:val="14"/>
+    <w:abstractNumId w:val="18"/>
   </w:num>
   <w:num w:numId="6">
-    <w:abstractNumId w:val="7"/>
+    <w:abstractNumId w:val="10"/>
   </w:num>
   <w:num w:numId="7">
     <w:abstractNumId w:val="0"/>
   </w:num>
   <w:num w:numId="8">
-    <w:abstractNumId w:val="8"/>
+    <w:abstractNumId w:val="11"/>
   </w:num>
   <w:num w:numId="9">
+    <w:abstractNumId w:val="4"/>
+  </w:num>
+  <w:num w:numId="10">
     <w:abstractNumId w:val="3"/>
   </w:num>
-  <w:num w:numId="10">
-    <w:abstractNumId w:val="2"/>
-  </w:num>
   <w:num w:numId="11">
-    <w:abstractNumId w:val="4"/>
+    <w:abstractNumId w:val="7"/>
   </w:num>
   <w:num w:numId="12">
-    <w:abstractNumId w:val="11"/>
+    <w:abstractNumId w:val="14"/>
   </w:num>
   <w:num w:numId="13">
     <w:abstractNumId w:val="1"/>
   </w:num>
   <w:num w:numId="14">
-    <w:abstractNumId w:val="13"/>
+    <w:abstractNumId w:val="16"/>
   </w:num>
   <w:num w:numId="15">
+    <w:abstractNumId w:val="9"/>
+  </w:num>
+  <w:num w:numId="16">
+    <w:abstractNumId w:val="8"/>
+  </w:num>
+  <w:num w:numId="17">
+    <w:abstractNumId w:val="2"/>
+  </w:num>
+  <w:num w:numId="18">
     <w:abstractNumId w:val="6"/>
   </w:num>
-  <w:num w:numId="16">
+  <w:num w:numId="19">
     <w:abstractNumId w:val="5"/>
+  </w:num>
+  <w:num w:numId="20">
+    <w:abstractNumId w:val="17"/>
   </w:num>
 </w:numbering>
 </file>

</xml_diff>